<commit_message>
feat: Add enrichment functionality for captages with commune and bassin data
- Implemented `enrich.py` to convert ESRI geometries to GeoJSON and enrich captages with commune and bassin information.
- Added dynamic counts configuration in `dyn_counts.txt`.
- Created `CatalogueView.tsx` for displaying catalog entries with pagination and detail view.
- Introduced `dyn-counts.lua` filter to inject dynamic counts as metadata in Pandoc documents.
- Added index file for the catalogue feature.
</commit_message>
<xml_diff>
--- a/custom-reference.docx
+++ b/custom-reference.docx
@@ -808,7 +808,7 @@
   <w:docDefaults>
     <w:rPrDefault>
       <w:rPr>
-        <w:rFonts w:ascii="Cambria" w:hAnsi="Cambria" w:eastAsia="Cambria" w:cs="" w:asciiTheme="minorHAnsi" w:cstheme="minorBidi" w:eastAsiaTheme="minorHAnsi" w:hAnsiTheme="minorHAnsi"/>
+        <w:rFonts w:ascii="Arial" w:hAnsi="Arial" w:eastAsia="Arial" w:cs="" w:asciiTheme="minorHAnsi" w:cstheme="minorBidi" w:eastAsiaTheme="minorHAnsi" w:hAnsiTheme="minorHAnsi"/>
         <w:sz w:val="24"/>
         <w:szCs w:val="24"/>
         <w:lang w:val="en-US" w:eastAsia="en-US" w:bidi="ar-SA"/>
@@ -1162,7 +1162,7 @@
       <w:jc w:val="left"/>
     </w:pPr>
     <w:rPr>
-      <w:rFonts w:ascii="Cambria" w:hAnsi="Cambria" w:eastAsia="Cambria" w:cs="" w:asciiTheme="minorHAnsi" w:cstheme="minorBidi" w:eastAsiaTheme="minorHAnsi" w:hAnsiTheme="minorHAnsi"/>
+      <w:rFonts w:ascii="Arial" w:hAnsi="Arial" w:eastAsia="Arial" w:cs="" w:asciiTheme="minorHAnsi" w:cstheme="minorBidi" w:eastAsiaTheme="minorHAnsi" w:hAnsiTheme="minorHAnsi"/>
       <w:color w:val="auto"/>
       <w:kern w:val="0"/>
       <w:sz w:val="24"/>
@@ -1602,7 +1602,7 @@
       <w:jc w:val="center"/>
     </w:pPr>
     <w:rPr>
-      <w:rFonts w:ascii="Cambria" w:hAnsi="Cambria" w:eastAsia="Cambria" w:cs="" w:asciiTheme="minorHAnsi" w:cstheme="minorBidi" w:eastAsiaTheme="minorHAnsi" w:hAnsiTheme="minorHAnsi"/>
+      <w:rFonts w:ascii="Arial" w:hAnsi="Arial" w:eastAsia="Arial" w:cs="" w:asciiTheme="minorHAnsi" w:cstheme="minorBidi" w:eastAsiaTheme="minorHAnsi" w:hAnsiTheme="minorHAnsi"/>
       <w:color w:val="auto"/>
       <w:kern w:val="0"/>
       <w:sz w:val="24"/>
@@ -1624,7 +1624,7 @@
       <w:jc w:val="center"/>
     </w:pPr>
     <w:rPr>
-      <w:rFonts w:ascii="Cambria" w:hAnsi="Cambria" w:eastAsia="Cambria" w:cs="" w:asciiTheme="minorHAnsi" w:cstheme="minorBidi" w:eastAsiaTheme="minorHAnsi" w:hAnsiTheme="minorHAnsi"/>
+      <w:rFonts w:ascii="Arial" w:hAnsi="Arial" w:eastAsia="Arial" w:cs="" w:asciiTheme="minorHAnsi" w:cstheme="minorBidi" w:eastAsiaTheme="minorHAnsi" w:hAnsiTheme="minorHAnsi"/>
       <w:color w:val="auto"/>
       <w:kern w:val="0"/>
       <w:sz w:val="24"/>
@@ -1933,7 +1933,7 @@
         <a:cs typeface=""/>
       </a:majorFont>
       <a:minorFont>
-        <a:latin typeface="Cambria" pitchFamily="0" charset="1"/>
+        <a:latin typeface="Arial" pitchFamily="0" charset="1"/>
         <a:ea typeface=""/>
         <a:cs typeface=""/>
       </a:minorFont>

</xml_diff>